<commit_message>
Define lógica de negocio y actualiza documentación
</commit_message>
<xml_diff>
--- a/documentacion/reglas_negocio/Reglas_de_Negocio_HwangHon_v0_3.docx
+++ b/documentacion/reglas_negocio/Reglas_de_Negocio_HwangHon_v0_3.docx
@@ -3816,21 +3816,21 @@
           <w:sz w:val="24"/>
           <w:szCs w:val="24"/>
         </w:rPr>
-        <w:t xml:space="preserve">[PENDIENTE DE VERIFICACIÓN] </w:t>
-      </w:r>
-    </w:p>
-    <w:p>
-      <w:pPr>
-        <w:spacing w:after="160"/>
-      </w:pPr>
-      <w:r>
-        <w:rPr>
-          <w:rFonts w:ascii="Arial" w:cs="Arial" w:eastAsia="Arial" w:hAnsi="Arial"/>
-          <w:color w:val="000000"/>
-          <w:sz w:val="24"/>
-          <w:szCs w:val="24"/>
-        </w:rPr>
-        <w:t xml:space="preserve">El club entrena solo sábados y domingos (confirmado). El denominador de sesiones para calcular el umbral de inasistencia (RN-5.2) depende del ciclo de exámenes (ver fechas en RN-5.4), no de un horario fijo aparte — pero esas fechas de examen todavía no están verificadas contra el documento fuente.</w:t>
+        <w:t xml:space="preserve">[CONFIRMADO] </w:t>
+      </w:r>
+    </w:p>
+    <w:p>
+      <w:pPr>
+        <w:spacing w:after="160"/>
+      </w:pPr>
+      <w:r>
+        <w:rPr>
+          <w:rFonts w:ascii="Arial" w:cs="Arial" w:eastAsia="Arial" w:hAnsi="Arial"/>
+          <w:color w:val="000000"/>
+          <w:sz w:val="24"/>
+          <w:szCs w:val="24"/>
+        </w:rPr>
+        <w:t xml:space="preserve">El club entrena solo sábados y domingos (confirmado). El denominador de sesiones para calcular el umbral de inasistencia (RN-5.2) depende del ciclo de exámenes (ver fechas en RN-5.4), no de un horario fijo aparte. Las fechas de examen ya están verificadas contra el Plan de Acción IMRDS 2026 (RN-5.4).</w:t>
       </w:r>
     </w:p>
     <w:p>

</xml_diff>